<commit_message>
Update SQL developer AI training CV
</commit_message>
<xml_diff>
--- a/Output/Pedro_Gutierrez_SQL_Developer_AI_Training_CV.docx
+++ b/Output/Pedro_Gutierrez_SQL_Developer_AI_Training_CV.docx
@@ -10,7 +10,7 @@
         <w:rPr>
           <w:rFonts w:ascii="Arial" w:hAnsi="Arial"/>
           <w:b/>
-          <w:sz w:val="32"/>
+          <w:sz w:val="29"/>
         </w:rPr>
         <w:t>PEDRO JAVIER GUTIERREZ ARMAS</w:t>
       </w:r>
@@ -23,9 +23,9 @@
         <w:rPr>
           <w:rFonts w:ascii="Arial" w:hAnsi="Arial"/>
           <w:b/>
-          <w:sz w:val="18"/>
+          <w:sz w:val="17"/>
         </w:rPr>
-        <w:t>SQL Developer | AI Training Data, Advanced SQL, Stored Procedures, Data Modeling &amp; Documentation</w:t>
+        <w:t>SQL Developer | Data Engineering | AI-Assisted Analytics Workflows</w:t>
       </w:r>
     </w:p>
     <w:p>
@@ -35,7 +35,7 @@
       <w:r>
         <w:rPr>
           <w:rFonts w:ascii="Arial" w:hAnsi="Arial"/>
-          <w:sz w:val="16"/>
+          <w:sz w:val="15"/>
         </w:rPr>
         <w:t>San Jose, Costa Rica | +506 6351-5860 | pj13eros@hotmail.com | linkedin.com/in/pedrogutierrez13</w:t>
       </w:r>
@@ -51,7 +51,7 @@
     </w:p>
     <w:p>
       <w:r>
-        <w:t>SQL Developer, Data Engineer, and SQL Server specialist with 15+ years of experience designing, developing, optimizing, troubleshooting, validating, and documenting database solutions across SQL Server, Snowflake SQL, PostgreSQL, MySQL, ETL/ELT, BI, reporting, and data warehousing. Strong hands-on background in advanced SQL, stored procedures, relational modeling, normalization, query tuning, indexing, data quality, and technical documentation. Current experience with AI-assisted analytics workflows, including Snowflake Cortex, MetricFlow semantic layer support, Cursor, and AI-assisted PR review bots. Skilled at translating business and technical requirements into reliable data assets, explaining database logic clearly, and collaborating remotely with cross-functional teams.</w:t>
+        <w:t>SQL Developer, Data Engineer, and SQL Server/Snowflake specialist with 15+ years of experience designing, developing, optimizing, troubleshooting, and documenting SQL-based data solutions. Strong hands-on background with complex SQL queries, stored procedures, relational database design, data modeling, ETL/ELT workflows, large dataset analysis, data validation, performance tuning, and analytics-ready datasets. Recent experience includes Snowflake SQL, dbt, MetricFlow semantic layer work, Snowflake Cortex, Cursor, AI-assisted PR review bots, and migration of C# reporting logic into SQL. Comfortable working remotely with cross-functional teams, explaining technical concepts clearly in English, and producing reliable documentation for SQL and data workflows.</w:t>
       </w:r>
     </w:p>
     <w:p>
@@ -60,42 +60,27 @@
         <w:keepNext/>
       </w:pPr>
       <w:r>
-        <w:t>CORE SKILLS</w:t>
+        <w:t>TECHNICAL SKILLS</w:t>
       </w:r>
     </w:p>
     <w:p>
       <w:r>
-        <w:t>Advanced SQL Development: SQL Server, T-SQL, Snowflake SQL, PostgreSQL, MySQL, stored procedures, complex queries, joins, aggregations, indexing, query optimization.</w:t>
+        <w:t>SQL Development: SQL Server, T-SQL, Snowflake SQL, stored procedures, functions, views, complex queries, query optimization, indexing, execution logic.</w:t>
       </w:r>
     </w:p>
     <w:p>
       <w:r>
-        <w:t>Data Modeling &amp; Databases: relational design, normalization, table/view structures, database objects, dimensional modeling, DWH modeling, Kimball practices.</w:t>
+        <w:t>Data Modeling &amp; Databases: relational database design, normalization concepts, table structures, database objects, data warehouse models, Kimball practices, PostgreSQL, MySQL.</w:t>
       </w:r>
     </w:p>
     <w:p>
       <w:r>
-        <w:t>AI / ML Data Workflows: Snowflake Cortex, MetricFlow semantic layer support, AI-assisted SQL development, Cursor, AI-assisted PR review bot, AI-ready analytical definitions.</w:t>
+        <w:t>Data Engineering &amp; Quality: ETL/ELT, SSIS, dbt, data transformation, data validation checks, anomaly detection, error handling, performance tuning, documentation.</w:t>
       </w:r>
     </w:p>
     <w:p>
       <w:r>
-        <w:t>Data Engineering: ETL/ELT, SSIS, dbt, data pipelines, data transformation, data warehousing, Salesforce integrations, analytics-ready datasets.</w:t>
-      </w:r>
-    </w:p>
-    <w:p>
-      <w:r>
-        <w:t>Quality &amp; Troubleshooting: validation checks, error handling, anomaly detection, data integrity, performance tuning, root-cause analysis, repeatable QA workflows.</w:t>
-      </w:r>
-    </w:p>
-    <w:p>
-      <w:r>
-        <w:t>Documentation &amp; Communication: technical documentation, data dictionaries, process documentation, stakeholder communication, user-facing explanations, remote collaboration.</w:t>
-      </w:r>
-    </w:p>
-    <w:p>
-      <w:r>
-        <w:t>Automation &amp; Analysis: Python, Pandas, NumPy, Matplotlib, PowerShell, automated validation, exploratory data analysis.</w:t>
+        <w:t>Analytics, Cloud &amp; AI Tools: Snowflake Cortex, MetricFlow, Power BI, SSRS, SSAS, Azure-based environments, Python, Pandas, NumPy, Matplotlib, PowerShell, Cursor, AI-assisted PR review bots.</w:t>
       </w:r>
     </w:p>
     <w:p>
@@ -115,7 +100,7 @@
         <w:rPr>
           <w:rFonts w:ascii="Arial" w:hAnsi="Arial"/>
           <w:b/>
-          <w:sz w:val="17"/>
+          <w:sz w:val="16"/>
         </w:rPr>
         <w:t>ServiceTitan - Snowflake Developer / Data Engineer</w:t>
       </w:r>
@@ -123,7 +108,7 @@
         <w:rPr>
           <w:rFonts w:ascii="Arial" w:hAnsi="Arial"/>
           <w:i/>
-          <w:sz w:val="16"/>
+          <w:sz w:val="15"/>
         </w:rPr>
         <w:t xml:space="preserve"> | September 2024 - Present | Remote / Costa Rica</w:t>
       </w:r>
@@ -133,7 +118,7 @@
         <w:pStyle w:val="ListBullet"/>
       </w:pPr>
       <w:r>
-        <w:t>Migrates C# reporting logic into Snowflake SQL to support scalable, maintainable reporting and analytics workflows.</w:t>
+        <w:t>Migrates C# reporting logic into Snowflake SQL to support scalable analytics workflows and reliable SQL-based reporting.</w:t>
       </w:r>
     </w:p>
     <w:p>
@@ -141,7 +126,7 @@
         <w:pStyle w:val="ListBullet"/>
       </w:pPr>
       <w:r>
-        <w:t>Creates and maintains dbt models within silver and gold data layers, improving model organization, reusability, and downstream reporting reliability.</w:t>
+        <w:t>Creates and maintains dbt models across silver and gold layers, improving model organization, reusability, and downstream reporting reliability.</w:t>
       </w:r>
     </w:p>
     <w:p>
@@ -149,7 +134,7 @@
         <w:pStyle w:val="ListBullet"/>
       </w:pPr>
       <w:r>
-        <w:t>Supports the development of the MetricFlow semantic layer, using Snowflake Cortex over the last 6 months to support AI-enabled analytics workflows, metric organization, and consistent analytical definitions.</w:t>
+        <w:t>Optimizes Snowflake SQL and dbt workloads, reducing data warehouse processing time by approximately 20% in an initial optimization phase.</w:t>
       </w:r>
     </w:p>
     <w:p>
@@ -157,7 +142,7 @@
         <w:pStyle w:val="ListBullet"/>
       </w:pPr>
       <w:r>
-        <w:t>Uses AI-assisted development tools such as Cursor and an AI bot for Git PR review to accelerate SQL development, review, debugging, and documentation workflows.</w:t>
+        <w:t>Supports MetricFlow semantic layer work with Snowflake Cortex to improve metric organization, analytical definitions, and AI-enabled analytics workflows.</w:t>
       </w:r>
     </w:p>
     <w:p>
@@ -165,15 +150,7 @@
         <w:pStyle w:val="ListBullet"/>
       </w:pPr>
       <w:r>
-        <w:t>Optimizes Snowflake SQL and dbt workloads, reducing Data Warehouse processing time by approximately 20% in an initial optimization phase.</w:t>
-      </w:r>
-    </w:p>
-    <w:p>
-      <w:pPr>
-        <w:pStyle w:val="ListBullet"/>
-      </w:pPr>
-      <w:r>
-        <w:t>Created a proof of concept for a new Data Warehouse model using Kimball methodology and best practices to define modeling standards and improve query and processing performance.</w:t>
+        <w:t>Uses AI-assisted development tools, including Cursor and PR review bots, as part of modern SQL/data engineering workflows.</w:t>
       </w:r>
     </w:p>
     <w:p>
@@ -184,7 +161,7 @@
         <w:rPr>
           <w:rFonts w:ascii="Arial" w:hAnsi="Arial"/>
           <w:b/>
-          <w:sz w:val="17"/>
+          <w:sz w:val="16"/>
         </w:rPr>
         <w:t>Intertec International - SQL Developer</w:t>
       </w:r>
@@ -192,7 +169,7 @@
         <w:rPr>
           <w:rFonts w:ascii="Arial" w:hAnsi="Arial"/>
           <w:i/>
-          <w:sz w:val="16"/>
+          <w:sz w:val="15"/>
         </w:rPr>
         <w:t xml:space="preserve"> | February 2019 - April 2021 | San Jose, Costa Rica</w:t>
       </w:r>
@@ -210,7 +187,7 @@
         <w:pStyle w:val="ListBullet"/>
       </w:pPr>
       <w:r>
-        <w:t>Consolidated multiple disparate data sources, including Salesforce and MySQL sources, into analytics-ready datasets using optimized ETL processes.</w:t>
+        <w:t>Reduced query execution times by up to 50% through SQL optimization, indexing strategies, and performance tuning.</w:t>
       </w:r>
     </w:p>
     <w:p>
@@ -226,7 +203,7 @@
         <w:pStyle w:val="ListBullet"/>
       </w:pPr>
       <w:r>
-        <w:t>Reduced query execution times by up to 50% through SQL optimization, indexing strategies, and performance tuning.</w:t>
+        <w:t>Consolidated multiple disparate data sources, including Salesforce and MySQL, into analytics-ready datasets using optimized ETL processes.</w:t>
       </w:r>
     </w:p>
     <w:p>
@@ -237,7 +214,7 @@
         <w:rPr>
           <w:rFonts w:ascii="Arial" w:hAnsi="Arial"/>
           <w:b/>
-          <w:sz w:val="17"/>
+          <w:sz w:val="16"/>
         </w:rPr>
         <w:t>SMASH Costa Rica - Data Engineer</w:t>
       </w:r>
@@ -245,17 +222,9 @@
         <w:rPr>
           <w:rFonts w:ascii="Arial" w:hAnsi="Arial"/>
           <w:i/>
-          <w:sz w:val="16"/>
+          <w:sz w:val="15"/>
         </w:rPr>
         <w:t xml:space="preserve"> | May 2021 - September 2024 | San Jose, Costa Rica</w:t>
-      </w:r>
-    </w:p>
-    <w:p>
-      <w:pPr>
-        <w:pStyle w:val="ListBullet"/>
-      </w:pPr>
-      <w:r>
-        <w:t>Designed and implemented customized ETL applications tailored to client requirements, reducing manual processing time by up to 40%.</w:t>
       </w:r>
     </w:p>
     <w:p>
@@ -271,7 +240,7 @@
         <w:pStyle w:val="ListBullet"/>
       </w:pPr>
       <w:r>
-        <w:t>Developed automated exploratory data analysis and validation tools with Pandas, NumPy, and Matplotlib to detect anomalies, improve validation accuracy by 30%, and accelerate reporting workflows.</w:t>
+        <w:t>Designed customized ETL applications tailored to client requirements, reducing manual processing time by up to 40%.</w:t>
       </w:r>
     </w:p>
     <w:p>
@@ -279,7 +248,15 @@
         <w:pStyle w:val="ListBullet"/>
       </w:pPr>
       <w:r>
-        <w:t>Prepared, cleaned, transformed, and modeled datasets for business reporting, Power BI dashboards, and operational decision-making.</w:t>
+        <w:t>Developed automated exploratory data analysis and validation tools using Pandas, NumPy, and Matplotlib to detect anomalies and improve data validation accuracy by 30%.</w:t>
+      </w:r>
+    </w:p>
+    <w:p>
+      <w:pPr>
+        <w:pStyle w:val="ListBullet"/>
+      </w:pPr>
+      <w:r>
+        <w:t>Prepared, cleaned, transformed, and modeled datasets for business reporting, dashboards, operational analysis, and decision-making.</w:t>
       </w:r>
     </w:p>
     <w:p>
@@ -290,52 +267,7 @@
         <w:rPr>
           <w:rFonts w:ascii="Arial" w:hAnsi="Arial"/>
           <w:b/>
-          <w:sz w:val="17"/>
-        </w:rPr>
-        <w:t>EL Tiempo - DBA / SQL Developer</w:t>
-      </w:r>
-      <w:r>
-        <w:rPr>
-          <w:rFonts w:ascii="Arial" w:hAnsi="Arial"/>
-          <w:i/>
           <w:sz w:val="16"/>
-        </w:rPr>
-        <w:t xml:space="preserve"> | September 2020 - November 2020 | Colombia</w:t>
-      </w:r>
-    </w:p>
-    <w:p>
-      <w:pPr>
-        <w:pStyle w:val="ListBullet"/>
-      </w:pPr>
-      <w:r>
-        <w:t>Supported migration projects for 10 databases, coordinating validation, data integrity checks, risk identification, and continuity of operations.</w:t>
-      </w:r>
-    </w:p>
-    <w:p>
-      <w:pPr>
-        <w:pStyle w:val="ListBullet"/>
-      </w:pPr>
-      <w:r>
-        <w:t>Worked with cross-functional teams to identify migration risks, validate data, and maintain database integrity during deployment activities.</w:t>
-      </w:r>
-    </w:p>
-    <w:p>
-      <w:pPr>
-        <w:pStyle w:val="ListBullet"/>
-      </w:pPr>
-      <w:r>
-        <w:t>Worked with SQL Server, SSIS, Azure, and SSRS to preserve reporting availability and continuity.</w:t>
-      </w:r>
-    </w:p>
-    <w:p>
-      <w:pPr>
-        <w:keepNext/>
-      </w:pPr>
-      <w:r>
-        <w:rPr>
-          <w:rFonts w:ascii="Arial" w:hAnsi="Arial"/>
-          <w:b/>
-          <w:sz w:val="17"/>
         </w:rPr>
         <w:t>Gold Data Networks - DBA / SQL &amp; BI Consultant</w:t>
       </w:r>
@@ -343,7 +275,7 @@
         <w:rPr>
           <w:rFonts w:ascii="Arial" w:hAnsi="Arial"/>
           <w:i/>
-          <w:sz w:val="16"/>
+          <w:sz w:val="15"/>
         </w:rPr>
         <w:t xml:space="preserve"> | January 2016 - February 2020 | Panama City, Panama</w:t>
       </w:r>
@@ -353,7 +285,7 @@
         <w:pStyle w:val="ListBullet"/>
       </w:pPr>
       <w:r>
-        <w:t>Built relational databases, table structures, custom objects, and stored procedures to support reporting workloads and backend processes.</w:t>
+        <w:t>Built relational databases and table structures from the ground up to support dynamic web applications and reporting workloads.</w:t>
       </w:r>
     </w:p>
     <w:p>
@@ -374,13 +306,21 @@
     </w:p>
     <w:p>
       <w:pPr>
+        <w:pStyle w:val="ListBullet"/>
+      </w:pPr>
+      <w:r>
+        <w:t>Worked with SQL Server, SSIS, SSRS, PostgreSQL, Power BI, and Excel across database development and reporting solutions.</w:t>
+      </w:r>
+    </w:p>
+    <w:p>
+      <w:pPr>
         <w:keepNext/>
       </w:pPr>
       <w:r>
         <w:rPr>
           <w:rFonts w:ascii="Arial" w:hAnsi="Arial"/>
           <w:b/>
-          <w:sz w:val="17"/>
+          <w:sz w:val="16"/>
         </w:rPr>
         <w:t>BAC Credomatic - Data Warehouse DBA</w:t>
       </w:r>
@@ -388,7 +328,7 @@
         <w:rPr>
           <w:rFonts w:ascii="Arial" w:hAnsi="Arial"/>
           <w:i/>
-          <w:sz w:val="16"/>
+          <w:sz w:val="15"/>
         </w:rPr>
         <w:t xml:space="preserve"> | November 2017 - January 2019 | San Jose, Costa Rica</w:t>
       </w:r>
@@ -398,7 +338,7 @@
         <w:pStyle w:val="ListBullet"/>
       </w:pPr>
       <w:r>
-        <w:t>Developed and maintained ETL pipelines to extract, transform, and load data from multiple sources into the Data Warehouse.</w:t>
+        <w:t>Developed and maintained ETL pipelines to extract, transform, and load data from multiple sources into the data warehouse.</w:t>
       </w:r>
     </w:p>
     <w:p>
@@ -414,7 +354,7 @@
         <w:pStyle w:val="ListBullet"/>
       </w:pPr>
       <w:r>
-        <w:t>Identified trends and hidden patterns in large datasets to support data-driven decision-making.</w:t>
+        <w:t>Improved operational efficiency by identifying trends and hidden patterns in large datasets for data-driven decision-making.</w:t>
       </w:r>
     </w:p>
     <w:p>
@@ -422,26 +362,7 @@
         <w:pStyle w:val="ListBullet"/>
       </w:pPr>
       <w:r>
-        <w:t>Supported SSAS, Power BI, SSRS, and Azure-based reporting environments for analytics at scale.</w:t>
-      </w:r>
-    </w:p>
-    <w:p>
-      <w:pPr>
-        <w:sectPr>
-          <w:pgSz w:w="12240" w:h="15840"/>
-          <w:pgMar w:top="648" w:right="792" w:bottom="648" w:left="792" w:header="360" w:footer="360" w:gutter="0"/>
-          <w:cols w:space="720"/>
-          <w:docGrid w:linePitch="360"/>
-        </w:sectPr>
-      </w:pPr>
-    </w:p>
-    <w:p>
-      <w:pPr>
-        <w:pStyle w:val="Heading1"/>
-        <w:keepNext/>
-      </w:pPr>
-      <w:r>
-        <w:t>ADDITIONAL SQL, DATABASE &amp; DOCUMENTATION EXPERIENCE</w:t>
+        <w:t>Worked with SQL Server, SSIS, SSAS, Power BI, SSRS, and Azure-based reporting environments.</w:t>
       </w:r>
     </w:p>
     <w:p>
@@ -452,17 +373,17 @@
         <w:rPr>
           <w:rFonts w:ascii="Arial" w:hAnsi="Arial"/>
           <w:b/>
-          <w:sz w:val="17"/>
+          <w:sz w:val="16"/>
         </w:rPr>
-        <w:t>Bosal - DBA and BI Consultant</w:t>
+        <w:t>EL Tiempo - DBA / SQL Developer</w:t>
       </w:r>
       <w:r>
         <w:rPr>
           <w:rFonts w:ascii="Arial" w:hAnsi="Arial"/>
           <w:i/>
-          <w:sz w:val="16"/>
+          <w:sz w:val="15"/>
         </w:rPr>
-        <w:t xml:space="preserve"> | March 2017 - March 2018 | Lummen, Belgium</w:t>
+        <w:t xml:space="preserve"> | September 2020 - November 2020 | Colombia</w:t>
       </w:r>
     </w:p>
     <w:p>
@@ -470,7 +391,7 @@
         <w:pStyle w:val="ListBullet"/>
       </w:pPr>
       <w:r>
-        <w:t>Designed the first stage of the company's main Data Warehouse and generated reports and presentations for senior management.</w:t>
+        <w:t>Led planning and execution of data migration projects for 10 databases, including validation, risk identification, and continuity support.</w:t>
       </w:r>
     </w:p>
     <w:p>
@@ -478,126 +399,7 @@
         <w:pStyle w:val="ListBullet"/>
       </w:pPr>
       <w:r>
-        <w:t>Supported BI/reporting delivery and shared database improvement practices with development teams.</w:t>
-      </w:r>
-    </w:p>
-    <w:p>
-      <w:pPr>
-        <w:keepNext/>
-      </w:pPr>
-      <w:r>
-        <w:rPr>
-          <w:rFonts w:ascii="Arial" w:hAnsi="Arial"/>
-          <w:b/>
-          <w:sz w:val="17"/>
-        </w:rPr>
-        <w:t>Xetux Solutions - Database Manager</w:t>
-      </w:r>
-      <w:r>
-        <w:rPr>
-          <w:rFonts w:ascii="Arial" w:hAnsi="Arial"/>
-          <w:i/>
-          <w:sz w:val="16"/>
-        </w:rPr>
-        <w:t xml:space="preserve"> | August 2016 - October 2017 | Caracas, Venezuela</w:t>
-      </w:r>
-    </w:p>
-    <w:p>
-      <w:pPr>
-        <w:pStyle w:val="ListBullet"/>
-      </w:pPr>
-      <w:r>
-        <w:t>Defined database management policies and improved performance and data security across business areas.</w:t>
-      </w:r>
-    </w:p>
-    <w:p>
-      <w:pPr>
-        <w:pStyle w:val="ListBullet"/>
-      </w:pPr>
-      <w:r>
-        <w:t>Created a data lake to consolidate sales data and support centralized reporting and analysis.</w:t>
-      </w:r>
-    </w:p>
-    <w:p>
-      <w:pPr>
-        <w:keepNext/>
-      </w:pPr>
-      <w:r>
-        <w:rPr>
-          <w:rFonts w:ascii="Arial" w:hAnsi="Arial"/>
-          <w:b/>
-          <w:sz w:val="17"/>
-        </w:rPr>
-        <w:t>ACH Cloud Services - SQL and BI Consultant</w:t>
-      </w:r>
-      <w:r>
-        <w:rPr>
-          <w:rFonts w:ascii="Arial" w:hAnsi="Arial"/>
-          <w:i/>
-          <w:sz w:val="16"/>
-        </w:rPr>
-        <w:t xml:space="preserve"> | August 2015 - August 2016 | Caracas, Venezuela</w:t>
-      </w:r>
-    </w:p>
-    <w:p>
-      <w:pPr>
-        <w:pStyle w:val="ListBullet"/>
-      </w:pPr>
-      <w:r>
-        <w:t>Administered and developed company databases supporting operational and reporting workflows.</w:t>
-      </w:r>
-    </w:p>
-    <w:p>
-      <w:pPr>
-        <w:pStyle w:val="ListBullet"/>
-      </w:pPr>
-      <w:r>
-        <w:t>Created dashboards and reports for customer billing management and documented the company's data environment.</w:t>
-      </w:r>
-    </w:p>
-    <w:p>
-      <w:pPr>
-        <w:keepNext/>
-      </w:pPr>
-      <w:r>
-        <w:rPr>
-          <w:rFonts w:ascii="Arial" w:hAnsi="Arial"/>
-          <w:b/>
-          <w:sz w:val="17"/>
-        </w:rPr>
-        <w:t>EducaTablet, VIGEOSOFT, Optica Caroni - Microsoft SQL Server DBA / Developer Analyst</w:t>
-      </w:r>
-      <w:r>
-        <w:rPr>
-          <w:rFonts w:ascii="Arial" w:hAnsi="Arial"/>
-          <w:i/>
-          <w:sz w:val="16"/>
-        </w:rPr>
-        <w:t xml:space="preserve"> | Previous Experience | Caracas, Venezuela</w:t>
-      </w:r>
-    </w:p>
-    <w:p>
-      <w:pPr>
-        <w:pStyle w:val="ListBullet"/>
-      </w:pPr>
-      <w:r>
-        <w:t>Administered, modeled, designed, configured, and programmed SQL Server databases for business applications and reporting.</w:t>
-      </w:r>
-    </w:p>
-    <w:p>
-      <w:pPr>
-        <w:pStyle w:val="ListBullet"/>
-      </w:pPr>
-      <w:r>
-        <w:t>Documented process and structure changes through data dictionary practices and stakeholder coordination.</w:t>
-      </w:r>
-    </w:p>
-    <w:p>
-      <w:pPr>
-        <w:pStyle w:val="ListBullet"/>
-      </w:pPr>
-      <w:r>
-        <w:t>Adjusted application and database processes to improve production workflows and management reporting.</w:t>
+        <w:t>Worked with cross-functional teams to validate data, maintain integrity, and support multi-platform migrations using SQL Server, SSIS, Azure, and SSRS.</w:t>
       </w:r>
     </w:p>
     <w:p>
@@ -606,63 +408,12 @@
         <w:keepNext/>
       </w:pPr>
       <w:r>
-        <w:t>EDUCATION &amp; CERTIFICATIONS</w:t>
+        <w:t>ADDITIONAL DATABASE EXPERIENCE</w:t>
       </w:r>
     </w:p>
     <w:p>
-      <w:pPr>
-        <w:pStyle w:val="ListBullet"/>
-      </w:pPr>
       <w:r>
-        <w:t>Systems Analyst, Informatics - IUT Dr. Federico Rivero Palacio.</w:t>
-      </w:r>
-    </w:p>
-    <w:p>
-      <w:pPr>
-        <w:pStyle w:val="ListBullet"/>
-      </w:pPr>
-      <w:r>
-        <w:t>English Certificate - Universidad Central de Venezuela / Microsoft.</w:t>
-      </w:r>
-    </w:p>
-    <w:p>
-      <w:pPr>
-        <w:pStyle w:val="ListBullet"/>
-      </w:pPr>
-      <w:r>
-        <w:t>SQL Admin Part 1.</w:t>
-      </w:r>
-    </w:p>
-    <w:p>
-      <w:pPr>
-        <w:pStyle w:val="ListBullet"/>
-      </w:pPr>
-      <w:r>
-        <w:t>Analyzing and Visualizing Data with Power BI.</w:t>
-      </w:r>
-    </w:p>
-    <w:p>
-      <w:pPr>
-        <w:pStyle w:val="ListBullet"/>
-      </w:pPr>
-      <w:r>
-        <w:t>Complete Data Science Training with Python for Data Analysis.</w:t>
-      </w:r>
-    </w:p>
-    <w:p>
-      <w:pPr>
-        <w:pStyle w:val="ListBullet"/>
-      </w:pPr>
-      <w:r>
-        <w:t>R Programming A-Z: R for Data Science.</w:t>
-      </w:r>
-    </w:p>
-    <w:p>
-      <w:pPr>
-        <w:pStyle w:val="ListBullet"/>
-      </w:pPr>
-      <w:r>
-        <w:t>Dataiku Core Designer.</w:t>
+        <w:t>Earlier roles include DBA and BI Consultant at Bosal, Database Manager at Xetux Solutions, SQL and BI Consultant at ACH Cloud Services, Microsoft SQL Server DBA at EducaTablet and VIGEOSOFT, and Developer Analyst at Optica Caroni C.A. Work included SQL Server development/administration, SSIS, SSRS, Azure-based environments, MySQL, Power BI, dashboards, data lake creation, documentation, database modeling, and training development teams on database programming good practices.</w:t>
       </w:r>
     </w:p>
     <w:p>
@@ -671,17 +422,17 @@
         <w:keepNext/>
       </w:pPr>
       <w:r>
-        <w:t>LANGUAGES</w:t>
+        <w:t>EDUCATION, CERTIFICATIONS &amp; LANGUAGES</w:t>
       </w:r>
     </w:p>
     <w:p>
       <w:r>
-        <w:t>Spanish: Native | English: Full Professional</w:t>
+        <w:t>Systems Analyst, Informatics - IUT Dr. Federico Rivero Palacio. Certifications and training: English Certificate - Universidad Central de Venezuela / Microsoft; SQL Admin Part 1; Analyzing and Visualizing Data with Power BI; Complete Data Science Training with Python for Data Analysis; R Programming A-Z; Dataiku Core Designer. Languages: Spanish native; English full professional.</w:t>
       </w:r>
     </w:p>
     <w:sectPr>
       <w:pgSz w:w="12240" w:h="15840"/>
-      <w:pgMar w:top="648" w:right="792" w:bottom="648" w:left="792" w:header="360" w:footer="360" w:gutter="0"/>
+      <w:pgMar w:top="576" w:right="792" w:bottom="576" w:left="792" w:header="360" w:footer="360" w:gutter="0"/>
       <w:cols w:space="720"/>
       <w:docGrid w:linePitch="360"/>
     </w:sectPr>
@@ -1053,11 +804,11 @@
     <w:qFormat/>
     <w:rsid w:val="00FC693F"/>
     <w:pPr>
-      <w:spacing w:after="40" w:line="240" w:lineRule="auto"/>
+      <w:spacing w:after="28" w:line="240" w:lineRule="auto"/>
     </w:pPr>
     <w:rPr>
       <w:rFonts w:ascii="Arial" w:hAnsi="Arial"/>
-      <w:sz w:val="17"/>
+      <w:sz w:val="16"/>
     </w:rPr>
   </w:style>
   <w:style w:type="paragraph" w:styleId="Header">
@@ -1115,15 +866,15 @@
     <w:pPr>
       <w:keepNext/>
       <w:keepLines/>
-      <w:spacing w:before="100" w:after="40"/>
+      <w:spacing w:before="80" w:after="28"/>
       <w:outlineLvl w:val="0"/>
     </w:pPr>
     <w:rPr>
       <w:rFonts w:asciiTheme="majorHAnsi" w:eastAsiaTheme="majorEastAsia" w:hAnsiTheme="majorHAnsi" w:cstheme="majorBidi" w:ascii="Arial" w:hAnsi="Arial"/>
       <w:b/>
       <w:bCs/>
-      <w:color w:val="365F91" w:themeColor="accent1" w:themeShade="BF"/>
-      <w:sz w:val="20"/>
+      <w:color w:val="2F5E91"/>
+      <w:sz w:val="19"/>
       <w:szCs w:val="28"/>
     </w:rPr>
   </w:style>
@@ -1139,15 +890,15 @@
     <w:pPr>
       <w:keepNext/>
       <w:keepLines/>
-      <w:spacing w:before="100" w:after="40"/>
+      <w:spacing w:before="200" w:after="0"/>
       <w:outlineLvl w:val="1"/>
     </w:pPr>
     <w:rPr>
-      <w:rFonts w:asciiTheme="majorHAnsi" w:eastAsiaTheme="majorEastAsia" w:hAnsiTheme="majorHAnsi" w:cstheme="majorBidi" w:ascii="Arial" w:hAnsi="Arial"/>
+      <w:rFonts w:asciiTheme="majorHAnsi" w:eastAsiaTheme="majorEastAsia" w:hAnsiTheme="majorHAnsi" w:cstheme="majorBidi"/>
       <w:b/>
       <w:bCs/>
       <w:color w:val="4F81BD" w:themeColor="accent1"/>
-      <w:sz w:val="18"/>
+      <w:sz w:val="26"/>
       <w:szCs w:val="26"/>
     </w:rPr>
   </w:style>
@@ -1586,13 +1337,13 @@
       <w:numPr>
         <w:numId w:val="1"/>
       </w:numPr>
-      <w:spacing w:after="20" w:line="240" w:lineRule="auto"/>
+      <w:spacing w:after="9" w:line="240" w:lineRule="auto"/>
       <w:ind w:left="259" w:hanging="144"/>
       <w:contextualSpacing/>
     </w:pPr>
     <w:rPr>
       <w:rFonts w:ascii="Arial" w:hAnsi="Arial"/>
-      <w:sz w:val="17"/>
+      <w:sz w:val="16"/>
     </w:rPr>
   </w:style>
   <w:style w:type="paragraph" w:styleId="ListBullet2">

</xml_diff>